<commit_message>
ADDING TODAY'S WORK - 01.07.2026
</commit_message>
<xml_diff>
--- a/write_up/drafts/2_introduction/introduction_DRAFT_1.docx
+++ b/write_up/drafts/2_introduction/introduction_DRAFT_1.docx
@@ -114,15 +114,7 @@
     </w:p>
     <w:p>
       <w:r>
-        <w:t xml:space="preserve">Extracellular </w:t>
-      </w:r>
-      <w:proofErr w:type="spellStart"/>
-      <w:r>
-        <w:t>vesicles</w:t>
-      </w:r>
-      <w:proofErr w:type="spellEnd"/>
-      <w:r>
-        <w:t xml:space="preserve"> (EVs) have been demonstrated to be involved in key cellular processes necessary for the maintenance of homeostasis (</w:t>
+        <w:t>Extracellular vesicles (EVs) have been demonstrated to be involved in key cellular processes necessary for the maintenance of homeostasis (</w:t>
       </w:r>
       <w:hyperlink r:id="rId8" w:history="1">
         <w:r>
@@ -149,15 +141,7 @@
     </w:p>
     <w:p>
       <w:r>
-        <w:t xml:space="preserve">Barrier homeostasis is maintained through various signalling mechanisms, including paracrine signalling by extracellular </w:t>
-      </w:r>
-      <w:proofErr w:type="spellStart"/>
-      <w:r>
-        <w:t>vesicles</w:t>
-      </w:r>
-      <w:proofErr w:type="spellEnd"/>
-      <w:r>
-        <w:t xml:space="preserve"> (EVs) [reference].</w:t>
+        <w:t>Barrier homeostasis is maintained through various signalling mechanisms, including paracrine signalling by extracellular vesicles (EVs) [reference].</w:t>
       </w:r>
       <w:r>
         <w:t xml:space="preserve"> </w:t>
@@ -284,10 +268,7 @@
         <w:t>ing</w:t>
       </w:r>
       <w:r>
-        <w:t xml:space="preserve"> microRNAs (miRNAs)</w:t>
-      </w:r>
-      <w:r>
-        <w:t xml:space="preserve">, small non-coding RNAs that </w:t>
+        <w:t xml:space="preserve"> microRNAs (miRNAs), small non-coding RNAs that </w:t>
       </w:r>
       <w:r>
         <w:t>exercise gene silencing through the post-transcriptional degradation of mRNAs (</w:t>
@@ -373,13 +354,7 @@
         <w:t xml:space="preserve">human bronchoalveolar lavage fluid (BALF) </w:t>
       </w:r>
       <w:r>
-        <w:t>and normal human bronchial epithelial cells (NHBE)</w:t>
-      </w:r>
-      <w:r>
-        <w:t>,</w:t>
-      </w:r>
-      <w:r>
-        <w:t xml:space="preserve"> </w:t>
+        <w:t xml:space="preserve">and normal human bronchial epithelial cells (NHBE), </w:t>
       </w:r>
       <w:r>
         <w:t xml:space="preserve">has been found to </w:t>
@@ -404,43 +379,7 @@
           <w:rPr>
             <w:rStyle w:val="Hyperlink"/>
           </w:rPr>
-          <w:t>https://onli</w:t>
-        </w:r>
-        <w:r>
-          <w:rPr>
-            <w:rStyle w:val="Hyperlink"/>
-          </w:rPr>
-          <w:t>n</w:t>
-        </w:r>
-        <w:r>
-          <w:rPr>
-            <w:rStyle w:val="Hyperlink"/>
-          </w:rPr>
-          <w:t>elibrary.wiley.</w:t>
-        </w:r>
-        <w:r>
-          <w:rPr>
-            <w:rStyle w:val="Hyperlink"/>
-          </w:rPr>
-          <w:t>c</w:t>
-        </w:r>
-        <w:r>
-          <w:rPr>
-            <w:rStyle w:val="Hyperlink"/>
-          </w:rPr>
-          <w:t>o</w:t>
-        </w:r>
-        <w:r>
-          <w:rPr>
-            <w:rStyle w:val="Hyperlink"/>
-          </w:rPr>
-          <w:t>m</w:t>
-        </w:r>
-        <w:r>
-          <w:rPr>
-            <w:rStyle w:val="Hyperlink"/>
-          </w:rPr>
-          <w:t>/doi/10.1111/all.14008</w:t>
+          <w:t>https://onlinelibrary.wiley.com/doi/10.1111/all.14008</w:t>
         </w:r>
       </w:hyperlink>
       <w:r>
@@ -451,55 +390,7 @@
           <w:rPr>
             <w:rStyle w:val="Hyperlink"/>
           </w:rPr>
-          <w:t>https://pubmed.</w:t>
-        </w:r>
-        <w:r>
-          <w:rPr>
-            <w:rStyle w:val="Hyperlink"/>
-          </w:rPr>
-          <w:t>n</w:t>
-        </w:r>
-        <w:r>
-          <w:rPr>
-            <w:rStyle w:val="Hyperlink"/>
-          </w:rPr>
-          <w:t>cbi.nlm.nih.gov/</w:t>
-        </w:r>
-        <w:r>
-          <w:rPr>
-            <w:rStyle w:val="Hyperlink"/>
-          </w:rPr>
-          <w:t>2</w:t>
-        </w:r>
-        <w:r>
-          <w:rPr>
-            <w:rStyle w:val="Hyperlink"/>
-          </w:rPr>
-          <w:t>33</w:t>
-        </w:r>
-        <w:r>
-          <w:rPr>
-            <w:rStyle w:val="Hyperlink"/>
-          </w:rPr>
-          <w:t>3</w:t>
-        </w:r>
-        <w:r>
-          <w:rPr>
-            <w:rStyle w:val="Hyperlink"/>
-          </w:rPr>
-          <w:t>3</w:t>
-        </w:r>
-        <w:r>
-          <w:rPr>
-            <w:rStyle w:val="Hyperlink"/>
-          </w:rPr>
-          <w:t>1</w:t>
-        </w:r>
-        <w:r>
-          <w:rPr>
-            <w:rStyle w:val="Hyperlink"/>
-          </w:rPr>
-          <w:t>13/</w:t>
+          <w:t>https://pubmed.ncbi.nlm.nih.gov/23333113/</w:t>
         </w:r>
       </w:hyperlink>
       <w:r>
@@ -510,19 +401,7 @@
           <w:rPr>
             <w:rStyle w:val="Hyperlink"/>
           </w:rPr>
-          <w:t>https://onlinelibrary.wiley.com/</w:t>
-        </w:r>
-        <w:r>
-          <w:rPr>
-            <w:rStyle w:val="Hyperlink"/>
-          </w:rPr>
-          <w:t>d</w:t>
-        </w:r>
-        <w:r>
-          <w:rPr>
-            <w:rStyle w:val="Hyperlink"/>
-          </w:rPr>
-          <w:t>oi/full/10.1111/cea.13016</w:t>
+          <w:t>https://onlinelibrary.wiley.com/doi/full/10.1111/cea.13016</w:t>
         </w:r>
       </w:hyperlink>
       <w:r>
@@ -589,13 +468,7 @@
     </w:p>
     <w:p>
       <w:r>
-        <w:t xml:space="preserve">Previous studies have found varying </w:t>
-      </w:r>
-      <w:r>
-        <w:t>quantities of miRNAs differentially expressed (DE)</w:t>
-      </w:r>
-      <w:r>
-        <w:t xml:space="preserve"> between healthy versus disease patients (e.g., asthma), and following exposure to allergens. </w:t>
+        <w:t xml:space="preserve">Previous studies have found varying quantities of miRNAs differentially expressed (DE) between healthy versus disease patients (e.g., asthma), and following exposure to allergens. </w:t>
       </w:r>
       <w:r>
         <w:t>Additionally, d</w:t>
@@ -644,6 +517,9 @@
       </w:r>
     </w:p>
     <w:p>
+      <w:r>
+        <w:t>Exposure thresholds of cells to protease/hdm_dog?</w:t>
+      </w:r>
       <w:r>
         <w:t xml:space="preserve"> </w:t>
       </w:r>
@@ -821,19 +697,7 @@
           <w:rPr>
             <w:rStyle w:val="Hyperlink"/>
           </w:rPr>
-          <w:t>https://www.nature.</w:t>
-        </w:r>
-        <w:r>
-          <w:rPr>
-            <w:rStyle w:val="Hyperlink"/>
-          </w:rPr>
-          <w:t>c</w:t>
-        </w:r>
-        <w:r>
-          <w:rPr>
-            <w:rStyle w:val="Hyperlink"/>
-          </w:rPr>
-          <w:t>om/articles/s12276-020-0450-9</w:t>
+          <w:t>https://www.nature.com/articles/s12276-020-0450-9</w:t>
         </w:r>
       </w:hyperlink>
       <w:r>
@@ -844,19 +708,7 @@
           <w:rPr>
             <w:rStyle w:val="Hyperlink"/>
           </w:rPr>
-          <w:t>https://onlinelibrary.wiley.com/</w:t>
-        </w:r>
-        <w:r>
-          <w:rPr>
-            <w:rStyle w:val="Hyperlink"/>
-          </w:rPr>
-          <w:t>d</w:t>
-        </w:r>
-        <w:r>
-          <w:rPr>
-            <w:rStyle w:val="Hyperlink"/>
-          </w:rPr>
-          <w:t>oi/full/10.1111/all.14008</w:t>
+          <w:t>https://onlinelibrary.wiley.com/doi/full/10.1111/all.14008</w:t>
         </w:r>
       </w:hyperlink>
       <w:r>
@@ -870,19 +722,7 @@
           <w:rPr>
             <w:rStyle w:val="Hyperlink"/>
           </w:rPr>
-          <w:t>https://pubmed.ncbi.nlm.nih.gov/233331</w:t>
-        </w:r>
-        <w:r>
-          <w:rPr>
-            <w:rStyle w:val="Hyperlink"/>
-          </w:rPr>
-          <w:t>1</w:t>
-        </w:r>
-        <w:r>
-          <w:rPr>
-            <w:rStyle w:val="Hyperlink"/>
-          </w:rPr>
-          <w:t>3/</w:t>
+          <w:t>https://pubmed.ncbi.nlm.nih.gov/23333113/</w:t>
         </w:r>
       </w:hyperlink>
       <w:r>
@@ -936,19 +776,7 @@
           <w:rPr>
             <w:rStyle w:val="Hyperlink"/>
           </w:rPr>
-          <w:t>https://pmc.ncbi.nlm.nih.gov/articles/PMC</w:t>
-        </w:r>
-        <w:r>
-          <w:rPr>
-            <w:rStyle w:val="Hyperlink"/>
-          </w:rPr>
-          <w:t>1</w:t>
-        </w:r>
-        <w:r>
-          <w:rPr>
-            <w:rStyle w:val="Hyperlink"/>
-          </w:rPr>
-          <w:t>2563611/</w:t>
+          <w:t>https://pmc.ncbi.nlm.nih.gov/articles/PMC12563611/</w:t>
         </w:r>
       </w:hyperlink>
       <w:r>
@@ -1003,19 +831,7 @@
           <w:rPr>
             <w:rStyle w:val="Hyperlink"/>
           </w:rPr>
-          <w:t>https://www.m</w:t>
-        </w:r>
-        <w:r>
-          <w:rPr>
-            <w:rStyle w:val="Hyperlink"/>
-          </w:rPr>
-          <w:t>d</w:t>
-        </w:r>
-        <w:r>
-          <w:rPr>
-            <w:rStyle w:val="Hyperlink"/>
-          </w:rPr>
-          <w:t>pi.com/1422-0067/26/12/5791</w:t>
+          <w:t>https://www.mdpi.com/1422-0067/26/12/5791</w:t>
         </w:r>
       </w:hyperlink>
       <w:r>
@@ -1073,23 +889,7 @@
     </w:p>
     <w:p>
       <w:r>
-        <w:t xml:space="preserve">DE analysis was previously performed for all allergen exposures by </w:t>
-      </w:r>
-      <w:proofErr w:type="spellStart"/>
-      <w:r>
-        <w:t>TamiRNA</w:t>
-      </w:r>
-      <w:proofErr w:type="spellEnd"/>
-      <w:r>
-        <w:t xml:space="preserve"> using the </w:t>
-      </w:r>
-      <w:proofErr w:type="spellStart"/>
-      <w:r>
-        <w:t>miND</w:t>
-      </w:r>
-      <w:proofErr w:type="spellEnd"/>
-      <w:r>
-        <w:t xml:space="preserve"> pipeline [reference], and pathway analysis performed by [Vicky] for protease exposure, as detailed in [reference]. Pathway analysis for HDM and dog exposure is novel.</w:t>
+        <w:t>DE analysis was previously performed for all allergen exposures by TamiRNA using the miND pipeline [reference], and pathway analysis performed by [Vicky] for protease exposure, as detailed in [reference]. Pathway analysis for HDM and dog exposure is novel.</w:t>
       </w:r>
     </w:p>
     <w:p/>

</xml_diff>

<commit_message>
ADDING TODAY'S WORK - 13.07.2026
</commit_message>
<xml_diff>
--- a/write_up/drafts/2_introduction/introduction_DRAFT_1.docx
+++ b/write_up/drafts/2_introduction/introduction_DRAFT_1.docx
@@ -19,7 +19,13 @@
     </w:p>
     <w:p>
       <w:r>
-        <w:t xml:space="preserve">Allergy-induced respiratory diseases represent a significant health burden, with an estimated 260 million cases of asthma </w:t>
+        <w:t xml:space="preserve">Allergy-induced respiratory diseases </w:t>
+      </w:r>
+      <w:r>
+        <w:t>constitute</w:t>
+      </w:r>
+      <w:r>
+        <w:t xml:space="preserve"> a significant health burden, with an estimated 260 million cases of asthma </w:t>
       </w:r>
       <w:r>
         <w:t>existing</w:t>
@@ -138,17 +144,6 @@
     </w:p>
     <w:p>
       <w:r>
-        <w:t xml:space="preserve">It is thought EVs have the potential to disrupt the epithelial barrier and </w:t>
-      </w:r>
-      <w:r>
-        <w:t>propagate</w:t>
-      </w:r>
-      <w:r>
-        <w:t xml:space="preserve"> airway inflammation.</w:t>
-      </w:r>
-    </w:p>
-    <w:p>
-      <w:r>
         <w:t xml:space="preserve">Barrier homeostasis is maintained through various signalling mechanisms, including paracrine signalling by extracellular </w:t>
       </w:r>
       <w:proofErr w:type="spellStart"/>
@@ -161,6 +156,11 @@
       </w:r>
       <w:r>
         <w:t xml:space="preserve"> </w:t>
+      </w:r>
+    </w:p>
+    <w:p>
+      <w:r>
+        <w:t>It is thought EVs have the potential to disrupt the epithelial barrier and propagate airway inflammation [references from GH’s paper].</w:t>
       </w:r>
     </w:p>
     <w:p/>
@@ -746,6 +746,15 @@
         </w:rPr>
         <w:t xml:space="preserve"> </w:t>
       </w:r>
+    </w:p>
+    <w:p>
+      <w:pPr>
+        <w:rPr>
+          <w:rFonts w:ascii="Aptos" w:eastAsia="Times New Roman" w:hAnsi="Aptos" w:cs="Calibri"/>
+          <w:color w:val="000000"/>
+          <w:lang w:eastAsia="en-GB"/>
+        </w:rPr>
+      </w:pPr>
       <w:r>
         <w:rPr>
           <w:rFonts w:ascii="Aptos" w:eastAsia="Times New Roman" w:hAnsi="Aptos" w:cs="Calibri"/>
@@ -975,6 +984,7 @@
     </w:p>
     <w:p>
       <w:r>
+        <w:lastRenderedPageBreak/>
         <w:t xml:space="preserve">Allergen exposure studies predominantly culture cells </w:t>
       </w:r>
       <w:r>
@@ -985,11 +995,7 @@
         <w:t>in vitro</w:t>
       </w:r>
       <w:r>
-        <w:t xml:space="preserve"> at the air-liquid-interface (ALI). Subsequently, ALI cultures are exposed to allergens either through submerging in a stimulant diluent or manually using hand spray. As allergens interact with the airway </w:t>
-      </w:r>
-      <w:r>
-        <w:lastRenderedPageBreak/>
-        <w:t>epithelium as aerosols, the spray method more closely reflects biology and prevents compromising the epithelial physiology, but its dosage delivery is inconsistent (</w:t>
+        <w:t xml:space="preserve"> at the air-liquid-interface (ALI). Subsequently, ALI cultures are exposed to allergens either through submerging in a stimulant diluent or manually using hand spray. As allergens interact with the airway epithelium as aerosols, the spray method more closely reflects biology and prevents compromising the epithelial physiology, but its dosage delivery is inconsistent (</w:t>
       </w:r>
       <w:hyperlink r:id="rId21" w:history="1">
         <w:r>

</xml_diff>